<commit_message>
added applicant name to barangay clearance and business
</commit_message>
<xml_diff>
--- a/public/files/BRGY-CLEARANCE-TEMPLATE.docx
+++ b/public/files/BRGY-CLEARANCE-TEMPLATE.docx
@@ -10,6 +10,92 @@
           <w:lang w:val="en-US"/>
         </w:rPr>
       </w:pPr>
+      <w:r>
+        <w:rPr>
+          <w:noProof/>
+        </w:rPr>
+        <mc:AlternateContent>
+          <mc:Choice Requires="wps">
+            <w:drawing>
+              <wp:anchor distT="0" distB="0" distL="114300" distR="114300" simplePos="0" relativeHeight="251723776" behindDoc="1" locked="0" layoutInCell="1" allowOverlap="1" wp14:anchorId="77FF10EB" wp14:editId="3F391ED4">
+                <wp:simplePos x="0" y="0"/>
+                <wp:positionH relativeFrom="page">
+                  <wp:posOffset>45085</wp:posOffset>
+                </wp:positionH>
+                <wp:positionV relativeFrom="paragraph">
+                  <wp:posOffset>8648700</wp:posOffset>
+                </wp:positionV>
+                <wp:extent cx="914400" cy="323850"/>
+                <wp:effectExtent l="0" t="0" r="0" b="0"/>
+                <wp:wrapNone/>
+                <wp:docPr id="379931101" name="Text Box 2" descr="Applicant Name"/>
+                <wp:cNvGraphicFramePr/>
+                <a:graphic xmlns:a="http://schemas.openxmlformats.org/drawingml/2006/main">
+                  <a:graphicData uri="http://schemas.microsoft.com/office/word/2010/wordprocessingShape">
+                    <wps:wsp>
+                      <wps:cNvSpPr txBox="1"/>
+                      <wps:spPr>
+                        <a:xfrm>
+                          <a:off x="0" y="0"/>
+                          <a:ext cx="914400" cy="323850"/>
+                        </a:xfrm>
+                        <a:prstGeom prst="rect">
+                          <a:avLst/>
+                        </a:prstGeom>
+                        <a:solidFill>
+                          <a:schemeClr val="lt1"/>
+                        </a:solidFill>
+                        <a:ln w="6350">
+                          <a:noFill/>
+                        </a:ln>
+                      </wps:spPr>
+                      <wps:txbx>
+                        <w:txbxContent>
+                          <w:p>
+                            <w:r>
+                              <w:t>APPLICANT NAME PLACEHOLDER</w:t>
+                            </w:r>
+                          </w:p>
+                        </w:txbxContent>
+                      </wps:txbx>
+                      <wps:bodyPr rot="0" spcFirstLastPara="0" vertOverflow="overflow" horzOverflow="overflow" vert="horz" wrap="none" lIns="91440" tIns="45720" rIns="91440" bIns="45720" numCol="1" spcCol="0" rtlCol="0" fromWordArt="0" anchor="t" anchorCtr="0" forceAA="0" compatLnSpc="1">
+                        <a:noAutofit/>
+                      </wps:bodyPr>
+                    </wps:wsp>
+                  </a:graphicData>
+                </a:graphic>
+              </wp:anchor>
+            </w:drawing>
+          </mc:Choice>
+          <mc:Fallback>
+            <w:pict>
+              <v:shapetype w14:anchorId="77FF10EB" id="_x0000_t202" coordsize="21600,21600" o:spt="202" path="m,l,21600r21600,l21600,xe">
+                <v:stroke joinstyle="miter"/>
+                <v:path gradientshapeok="t" o:connecttype="rect"/>
+              </v:shapetype>
+              <v:shape id="Text Box 2" o:spid="_x0000_s1026" type="#_x0000_t202" alt="Applicant Name" style="position:absolute;left:0;text-align:left;margin-left:3.55pt;margin-top:681pt;width:1in;height:25.5pt;z-index:-251592704;visibility:visible;mso-wrap-style:none;mso-wrap-distance-left:9pt;mso-wrap-distance-top:0;mso-wrap-distance-right:9pt;mso-wrap-distance-bottom:0;mso-position-horizontal:absolute;mso-position-horizontal-relative:page;mso-position-vertical:absolute;mso-position-vertical-relative:text;v-text-anchor:top" o:gfxdata="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" fillcolor="white [3201]" stroked="f" strokeweight=".5pt">
+                <v:textbox>
+                  <w:txbxContent>
+                    <w:p>
+                      <w:r>
+                        <w:t>APPLICANT NAME PLACEHOLDER</w:t>
+                      </w:r>
+                    </w:p>
+                  </w:txbxContent>
+                </v:textbox>
+                <w10:wrap anchorx="page"/>
+              </v:shape>
+            </w:pict>
+          </mc:Fallback>
+        </mc:AlternateContent>
+      </w:r>
+      <w:r>
+        <w:rPr>
+          <w:b/>
+          <w:bCs/>
+        </w:rPr>
+        <w:t>d</w:t>
+      </w:r>
       <w:r>
         <w:rPr>
           <w:noProof/>
@@ -160,11 +246,11 @@
           </mc:Choice>
           <mc:Fallback>
             <w:pict>
-              <v:group w14:anchorId="2244E269" id="Group 61" o:spid="_x0000_s1026" alt="Digital Seal" style="position:absolute;left:0;text-align:left;margin-left:420pt;margin-top:675.6pt;width:83.3pt;height:83.4pt;z-index:251699200" coordsize="10584,10591" o:gfxdata="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">
+              <v:group w14:anchorId="2244E269" id="Group 61" o:spid="_x0000_s1027" alt="Digital Seal" style="position:absolute;left:0;text-align:left;margin-left:420pt;margin-top:675.6pt;width:83.3pt;height:83.4pt;z-index:251699200" coordsize="10584,10591" o:gfxdata="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">
                 <v:shapetype id="_x0000_t120" coordsize="21600,21600" o:spt="120" path="m10800,qx,10800,10800,21600,21600,10800,10800,xe">
                   <v:path gradientshapeok="t" o:connecttype="custom" o:connectlocs="10800,0;3163,3163;0,10800;3163,18437;10800,21600;18437,18437;21600,10800;18437,3163" textboxrect="3163,3163,18437,18437"/>
                 </v:shapetype>
-                <v:shape id="Flowchart: Connector 8" o:spid="_x0000_s1027" type="#_x0000_t120" style="position:absolute;width:10584;height:10591;visibility:visible;mso-wrap-style:square;v-text-anchor:middle" o:gfxdata="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" fillcolor="white [3201]" strokecolor="#7f7f7f [1612]" strokeweight=".25pt">
+                <v:shape id="Flowchart: Connector 8" o:spid="_x0000_s1028" type="#_x0000_t120" style="position:absolute;width:10584;height:10591;visibility:visible;mso-wrap-style:square;v-text-anchor:middle" o:gfxdata="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" fillcolor="white [3201]" strokecolor="#7f7f7f [1612]" strokeweight=".25pt">
                   <v:stroke joinstyle="miter"/>
                   <v:textbox>
                     <w:txbxContent>
@@ -176,11 +262,7 @@
                     </w:txbxContent>
                   </v:textbox>
                 </v:shape>
-                <v:shapetype id="_x0000_t202" coordsize="21600,21600" o:spt="202" path="m,l,21600r21600,l21600,xe">
-                  <v:stroke joinstyle="miter"/>
-                  <v:path gradientshapeok="t" o:connecttype="rect"/>
-                </v:shapetype>
-                <v:shape id="_x0000_s1028" type="#_x0000_t202" style="position:absolute;left:1308;top:3768;width:8088;height:3689;visibility:visible;mso-wrap-style:square;v-text-anchor:top" o:gfxdata="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" stroked="f">
+                <v:shape id="_x0000_s1029" type="#_x0000_t202" style="position:absolute;left:1308;top:3768;width:8088;height:3689;visibility:visible;mso-wrap-style:square;v-text-anchor:top" o:gfxdata="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" stroked="f">
                   <v:textbox style="mso-fit-shape-to-text:t">
                     <w:txbxContent>
                       <w:p>
@@ -493,7 +575,7 @@
           </mc:Choice>
           <mc:Fallback>
             <w:pict>
-              <v:shape w14:anchorId="7DE8F635" id="Text Box 1" o:spid="_x0000_s1029" type="#_x0000_t202" style="position:absolute;left:0;text-align:left;margin-left:133pt;margin-top:386.25pt;width:375pt;height:48.5pt;z-index:251691008;visibility:visible;mso-wrap-style:square;mso-wrap-distance-left:9pt;mso-wrap-distance-top:0;mso-wrap-distance-right:9pt;mso-wrap-distance-bottom:0;mso-position-horizontal:absolute;mso-position-horizontal-relative:text;mso-position-vertical:absolute;mso-position-vertical-relative:text;v-text-anchor:top" o:gfxdata="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" filled="f" stroked="f" strokeweight=".5pt">
+              <v:shape w14:anchorId="7DE8F635" id="Text Box 1" o:spid="_x0000_s1030" type="#_x0000_t202" style="position:absolute;left:0;text-align:left;margin-left:133pt;margin-top:386.25pt;width:375pt;height:48.5pt;z-index:251691008;visibility:visible;mso-wrap-style:square;mso-wrap-distance-left:9pt;mso-wrap-distance-top:0;mso-wrap-distance-right:9pt;mso-wrap-distance-bottom:0;mso-position-horizontal:absolute;mso-position-horizontal-relative:text;mso-position-vertical:absolute;mso-position-vertical-relative:text;v-text-anchor:top" o:gfxdata="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" filled="f" stroked="f" strokeweight=".5pt">
                 <v:textbox>
                   <w:txbxContent>
                     <w:p>
@@ -595,7 +677,7 @@
           </mc:Choice>
           <mc:Fallback>
             <w:pict>
-              <v:shape w14:anchorId="72FE16B1" id="Text Box 2" o:spid="_x0000_s1030" type="#_x0000_t202" style="position:absolute;left:0;text-align:left;margin-left:129.05pt;margin-top:335.6pt;width:377.25pt;height:46.15pt;z-index:251689984;visibility:visible;mso-wrap-style:square;mso-wrap-distance-left:9pt;mso-wrap-distance-top:3.6pt;mso-wrap-distance-right:9pt;mso-wrap-distance-bottom:3.6pt;mso-position-horizontal:absolute;mso-position-horizontal-relative:text;mso-position-vertical:absolute;mso-position-vertical-relative:text;v-text-anchor:top" o:gfxdata="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" filled="f" stroked="f">
+              <v:shape w14:anchorId="72FE16B1" id="_x0000_s1031" type="#_x0000_t202" style="position:absolute;left:0;text-align:left;margin-left:129.05pt;margin-top:335.6pt;width:377.25pt;height:46.15pt;z-index:251689984;visibility:visible;mso-wrap-style:square;mso-wrap-distance-left:9pt;mso-wrap-distance-top:3.6pt;mso-wrap-distance-right:9pt;mso-wrap-distance-bottom:3.6pt;mso-position-horizontal:absolute;mso-position-horizontal-relative:text;mso-position-vertical:absolute;mso-position-vertical-relative:text;v-text-anchor:top" o:gfxdata="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" filled="f" stroked="f">
                 <v:textbox>
                   <w:txbxContent>
                     <w:p>
@@ -705,7 +787,7 @@
           </mc:Choice>
           <mc:Fallback>
             <w:pict>
-              <v:shape w14:anchorId="1D8DB819" id="_x0000_s1031" type="#_x0000_t202" style="position:absolute;left:0;text-align:left;margin-left:122.2pt;margin-top:244.95pt;width:381.75pt;height:110.25pt;z-index:251687936;visibility:visible;mso-wrap-style:square;mso-wrap-distance-left:9pt;mso-wrap-distance-top:3.6pt;mso-wrap-distance-right:9pt;mso-wrap-distance-bottom:3.6pt;mso-position-horizontal:absolute;mso-position-horizontal-relative:text;mso-position-vertical:absolute;mso-position-vertical-relative:text;v-text-anchor:top" o:gfxdata="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" filled="f" stroked="f">
+              <v:shape w14:anchorId="1D8DB819" id="_x0000_s1032" type="#_x0000_t202" style="position:absolute;left:0;text-align:left;margin-left:122.2pt;margin-top:244.95pt;width:381.75pt;height:110.25pt;z-index:251687936;visibility:visible;mso-wrap-style:square;mso-wrap-distance-left:9pt;mso-wrap-distance-top:3.6pt;mso-wrap-distance-right:9pt;mso-wrap-distance-bottom:3.6pt;mso-position-horizontal:absolute;mso-position-horizontal-relative:text;mso-position-vertical:absolute;mso-position-vertical-relative:text;v-text-anchor:top" o:gfxdata="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" filled="f" stroked="f">
                 <v:textbox>
                   <w:txbxContent>
                     <w:p>
@@ -814,7 +896,7 @@
           </mc:Choice>
           <mc:Fallback>
             <w:pict>
-              <v:shape w14:anchorId="3D3E1BD6" id="_x0000_s1032" type="#_x0000_t202" style="position:absolute;left:0;text-align:left;margin-left:121.5pt;margin-top:201pt;width:185.9pt;height:23.25pt;z-index:251686912;visibility:visible;mso-wrap-style:square;mso-width-percent:400;mso-height-percent:0;mso-wrap-distance-left:9pt;mso-wrap-distance-top:3.6pt;mso-wrap-distance-right:9pt;mso-wrap-distance-bottom:3.6pt;mso-position-horizontal:absolute;mso-position-horizontal-relative:text;mso-position-vertical:absolute;mso-position-vertical-relative:text;mso-width-percent:400;mso-height-percent:0;mso-width-relative:margin;mso-height-relative:page;v-text-anchor:top" o:gfxdata="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" filled="f" stroked="f">
+              <v:shape w14:anchorId="3D3E1BD6" id="_x0000_s1033" type="#_x0000_t202" style="position:absolute;left:0;text-align:left;margin-left:121.5pt;margin-top:201pt;width:185.9pt;height:23.25pt;z-index:251686912;visibility:visible;mso-wrap-style:square;mso-width-percent:400;mso-height-percent:0;mso-wrap-distance-left:9pt;mso-wrap-distance-top:3.6pt;mso-wrap-distance-right:9pt;mso-wrap-distance-bottom:3.6pt;mso-position-horizontal:absolute;mso-position-horizontal-relative:text;mso-position-vertical:absolute;mso-position-vertical-relative:text;mso-width-percent:400;mso-height-percent:0;mso-width-relative:margin;mso-height-relative:page;v-text-anchor:top" o:gfxdata="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" filled="f" stroked="f">
                 <v:textbox>
                   <w:txbxContent>
                     <w:p>
@@ -976,7 +1058,7 @@
           </mc:Choice>
           <mc:Fallback>
             <w:pict>
-              <v:shape w14:anchorId="1F1D9F9B" id="_x0000_s1033" type="#_x0000_t202" style="position:absolute;left:0;text-align:left;margin-left:168.75pt;margin-top:145.1pt;width:292.2pt;height:110.6pt;z-index:251685888;visibility:visible;mso-wrap-style:square;mso-width-percent:0;mso-height-percent:200;mso-wrap-distance-left:9pt;mso-wrap-distance-top:3.6pt;mso-wrap-distance-right:9pt;mso-wrap-distance-bottom:3.6pt;mso-position-horizontal:absolute;mso-position-horizontal-relative:margin;mso-position-vertical:absolute;mso-position-vertical-relative:text;mso-width-percent:0;mso-height-percent:200;mso-width-relative:page;mso-height-relative:margin;v-text-anchor:top" o:gfxdata="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" filled="f" stroked="f">
+              <v:shape w14:anchorId="1F1D9F9B" id="_x0000_s1034" type="#_x0000_t202" style="position:absolute;left:0;text-align:left;margin-left:168.75pt;margin-top:145.1pt;width:292.2pt;height:110.6pt;z-index:251685888;visibility:visible;mso-wrap-style:square;mso-width-percent:0;mso-height-percent:200;mso-wrap-distance-left:9pt;mso-wrap-distance-top:3.6pt;mso-wrap-distance-right:9pt;mso-wrap-distance-bottom:3.6pt;mso-position-horizontal:absolute;mso-position-horizontal-relative:margin;mso-position-vertical:absolute;mso-position-vertical-relative:text;mso-width-percent:0;mso-height-percent:200;mso-width-relative:page;mso-height-relative:margin;v-text-anchor:top" o:gfxdata="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" filled="f" stroked="f">
                 <v:textbox style="mso-fit-shape-to-text:t">
                   <w:txbxContent>
                     <w:p>
@@ -1091,7 +1173,7 @@
           </mc:Choice>
           <mc:Fallback>
             <w:pict>
-              <v:shape w14:anchorId="746DFA18" id="_x0000_s1034" type="#_x0000_t202" style="position:absolute;left:0;text-align:left;margin-left:300.6pt;margin-top:593.65pt;width:210.45pt;height:39.75pt;z-index:251693056;visibility:visible;mso-wrap-style:square;mso-wrap-distance-left:9pt;mso-wrap-distance-top:3.6pt;mso-wrap-distance-right:9pt;mso-wrap-distance-bottom:3.6pt;mso-position-horizontal:absolute;mso-position-horizontal-relative:text;mso-position-vertical:absolute;mso-position-vertical-relative:text;v-text-anchor:top" o:gfxdata="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" filled="f" stroked="f">
+              <v:shape w14:anchorId="746DFA18" id="_x0000_s1035" type="#_x0000_t202" style="position:absolute;left:0;text-align:left;margin-left:300.6pt;margin-top:593.65pt;width:210.45pt;height:39.75pt;z-index:251693056;visibility:visible;mso-wrap-style:square;mso-wrap-distance-left:9pt;mso-wrap-distance-top:3.6pt;mso-wrap-distance-right:9pt;mso-wrap-distance-bottom:3.6pt;mso-position-horizontal:absolute;mso-position-horizontal-relative:text;mso-position-vertical:absolute;mso-position-vertical-relative:text;v-text-anchor:top" o:gfxdata="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" filled="f" stroked="f">
                 <v:textbox>
                   <w:txbxContent>
                     <w:p>
@@ -1219,7 +1301,7 @@
           </mc:Choice>
           <mc:Fallback>
             <w:pict>
-              <v:shape w14:anchorId="04C49EC0" id="_x0000_s1035" type="#_x0000_t202" style="position:absolute;left:0;text-align:left;margin-left:323.7pt;margin-top:521.65pt;width:185.9pt;height:40.5pt;z-index:251692032;visibility:visible;mso-wrap-style:square;mso-width-percent:400;mso-height-percent:0;mso-wrap-distance-left:9pt;mso-wrap-distance-top:3.6pt;mso-wrap-distance-right:9pt;mso-wrap-distance-bottom:3.6pt;mso-position-horizontal:absolute;mso-position-horizontal-relative:text;mso-position-vertical:absolute;mso-position-vertical-relative:text;mso-width-percent:400;mso-height-percent:0;mso-width-relative:margin;mso-height-relative:page;v-text-anchor:top" o:gfxdata="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" filled="f" stroked="f">
+              <v:shape w14:anchorId="04C49EC0" id="_x0000_s1036" type="#_x0000_t202" style="position:absolute;left:0;text-align:left;margin-left:323.7pt;margin-top:521.65pt;width:185.9pt;height:40.5pt;z-index:251692032;visibility:visible;mso-wrap-style:square;mso-width-percent:400;mso-height-percent:0;mso-wrap-distance-left:9pt;mso-wrap-distance-top:3.6pt;mso-wrap-distance-right:9pt;mso-wrap-distance-bottom:3.6pt;mso-position-horizontal:absolute;mso-position-horizontal-relative:text;mso-position-vertical:absolute;mso-position-vertical-relative:text;mso-width-percent:400;mso-height-percent:0;mso-width-relative:margin;mso-height-relative:page;v-text-anchor:top" o:gfxdata="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" filled="f" stroked="f">
                 <v:textbox>
                   <w:txbxContent>
                     <w:p>
@@ -1403,7 +1485,7 @@
           </mc:Choice>
           <mc:Fallback>
             <w:pict>
-              <v:shape w14:anchorId="3A2A6AE1" id="_x0000_s1036" type="#_x0000_t202" style="position:absolute;left:0;text-align:left;margin-left:0;margin-top:701.85pt;width:1in;height:25.5pt;z-index:251694080;visibility:visible;mso-wrap-style:none;mso-wrap-distance-left:9pt;mso-wrap-distance-top:0;mso-wrap-distance-right:9pt;mso-wrap-distance-bottom:0;mso-position-horizontal:left;mso-position-horizontal-relative:page;mso-position-vertical:absolute;mso-position-vertical-relative:text;v-text-anchor:top" o:gfxdata="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" fillcolor="white [3201]" stroked="f" strokeweight=".5pt">
+              <v:shape w14:anchorId="3A2A6AE1" id="_x0000_s1037" type="#_x0000_t202" style="position:absolute;left:0;text-align:left;margin-left:0;margin-top:701.85pt;width:1in;height:25.5pt;z-index:251694080;visibility:visible;mso-wrap-style:none;mso-wrap-distance-left:9pt;mso-wrap-distance-top:0;mso-wrap-distance-right:9pt;mso-wrap-distance-bottom:0;mso-position-horizontal:left;mso-position-horizontal-relative:page;mso-position-vertical:absolute;mso-position-vertical-relative:text;v-text-anchor:top" o:gfxdata="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" fillcolor="white [3201]" stroked="f" strokeweight=".5pt">
                 <v:textbox>
                   <w:txbxContent>
                     <w:p>
@@ -1978,7 +2060,7 @@
           </mc:Choice>
           <mc:Fallback>
             <w:pict>
-              <v:group w14:anchorId="41DFD307" id="Group 583640925" o:spid="_x0000_s1037" style="position:absolute;left:0;text-align:left;margin-left:0;margin-top:50pt;width:595.5pt;height:841.4pt;z-index:251658240;mso-position-horizontal:center;mso-position-horizontal-relative:margin;mso-position-vertical-relative:page;mso-width-relative:margin;mso-height-relative:margin" coordsize="75628,106859" o:gfxdata="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">
+              <v:group w14:anchorId="41DFD307" id="Group 583640925" o:spid="_x0000_s1038" style="position:absolute;left:0;text-align:left;margin-left:0;margin-top:50pt;width:595.5pt;height:841.4pt;z-index:251658240;mso-position-horizontal:center;mso-position-horizontal-relative:margin;mso-position-vertical-relative:page;mso-width-relative:margin;mso-height-relative:margin" coordsize="75628,106859" o:gfxdata="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">
                 <v:shapetype id="_x0000_t75" coordsize="21600,21600" o:spt="75" o:preferrelative="t" path="m@4@5l@4@11@9@11@9@5xe" filled="f" stroked="f">
                   <v:stroke joinstyle="miter"/>
                   <v:formulas>
@@ -1998,13 +2080,13 @@
                   <v:path o:extrusionok="f" gradientshapeok="t" o:connecttype="rect"/>
                   <o:lock v:ext="edit" aspectratio="t"/>
                 </v:shapetype>
-                <v:shape id="Picture 296968587" o:spid="_x0000_s1038" type="#_x0000_t75" style="position:absolute;width:75438;height:15575;visibility:visible;mso-wrap-style:square" o:gfxdata="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">
+                <v:shape id="Picture 296968587" o:spid="_x0000_s1039" type="#_x0000_t75" style="position:absolute;width:75438;height:15575;visibility:visible;mso-wrap-style:square" o:gfxdata="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">
                   <v:imagedata r:id="rId15" o:title=""/>
                 </v:shape>
-                <v:shape id="Picture 1795248927" o:spid="_x0000_s1039" type="#_x0000_t75" style="position:absolute;left:910;top:18578;width:22669;height:70033;visibility:visible;mso-wrap-style:square" o:gfxdata="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">
+                <v:shape id="Picture 1795248927" o:spid="_x0000_s1040" type="#_x0000_t75" style="position:absolute;left:910;top:18578;width:22669;height:70033;visibility:visible;mso-wrap-style:square" o:gfxdata="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">
                   <v:imagedata r:id="rId16" o:title=""/>
                 </v:shape>
-                <v:rect id="Rectangle 2113903759" o:spid="_x0000_s1040" style="position:absolute;left:28571;top:5411;width:24546;height:2331;visibility:visible;mso-wrap-style:square;v-text-anchor:top" o:gfxdata="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" filled="f" stroked="f">
+                <v:rect id="Rectangle 2113903759" o:spid="_x0000_s1041" style="position:absolute;left:28571;top:5411;width:24546;height:2331;visibility:visible;mso-wrap-style:square;v-text-anchor:top" o:gfxdata="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" filled="f" stroked="f">
                   <v:textbox inset="0,0,0,0">
                     <w:txbxContent>
                       <w:p>
@@ -2083,7 +2165,7 @@
                     </w:txbxContent>
                   </v:textbox>
                 </v:rect>
-                <v:rect id="Rectangle 569965918" o:spid="_x0000_s1041" style="position:absolute;left:31650;top:8800;width:16353;height:2331;visibility:visible;mso-wrap-style:square;v-text-anchor:top" o:gfxdata="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" filled="f" stroked="f">
+                <v:rect id="Rectangle 569965918" o:spid="_x0000_s1042" style="position:absolute;left:31650;top:8800;width:16353;height:2331;visibility:visible;mso-wrap-style:square;v-text-anchor:top" o:gfxdata="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" filled="f" stroked="f">
                   <v:textbox inset="0,0,0,0">
                     <w:txbxContent>
                       <w:p>
@@ -2124,7 +2206,7 @@
                     </w:txbxContent>
                   </v:textbox>
                 </v:rect>
-                <v:rect id="Rectangle 750717535" o:spid="_x0000_s1042" style="position:absolute;left:33223;top:10533;width:12170;height:2331;visibility:visible;mso-wrap-style:square;v-text-anchor:top" o:gfxdata="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" filled="f" stroked="f">
+                <v:rect id="Rectangle 750717535" o:spid="_x0000_s1043" style="position:absolute;left:33223;top:10533;width:12170;height:2331;visibility:visible;mso-wrap-style:square;v-text-anchor:top" o:gfxdata="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" filled="f" stroked="f">
                   <v:textbox inset="0,0,0,0">
                     <w:txbxContent>
                       <w:p>
@@ -2165,10 +2247,10 @@
                     </w:txbxContent>
                   </v:textbox>
                 </v:rect>
-                <v:shape id="Picture 236908872" o:spid="_x0000_s1043" type="#_x0000_t75" style="position:absolute;top:100225;width:75438;height:6634;visibility:visible;mso-wrap-style:square" o:gfxdata="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">
+                <v:shape id="Picture 236908872" o:spid="_x0000_s1044" type="#_x0000_t75" style="position:absolute;top:100225;width:75438;height:6634;visibility:visible;mso-wrap-style:square" o:gfxdata="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">
                   <v:imagedata r:id="rId17" o:title=""/>
                 </v:shape>
-                <v:rect id="Rectangle 1186820149" o:spid="_x0000_s1044" style="position:absolute;left:26983;top:6954;width:28768;height:2973;visibility:visible;mso-wrap-style:square;v-text-anchor:top" o:gfxdata="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" filled="f" stroked="f">
+                <v:rect id="Rectangle 1186820149" o:spid="_x0000_s1045" style="position:absolute;left:26983;top:6954;width:28768;height:2973;visibility:visible;mso-wrap-style:square;v-text-anchor:top" o:gfxdata="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" filled="f" stroked="f">
                   <v:textbox inset="0,0,0,0">
                     <w:txbxContent>
                       <w:p>
@@ -2288,13 +2370,13 @@
                     </w:txbxContent>
                   </v:textbox>
                 </v:rect>
-                <v:shape id="Picture 1253694580" o:spid="_x0000_s1045" type="#_x0000_t75" style="position:absolute;left:55337;top:4101;width:9388;height:9632;visibility:visible;mso-wrap-style:square" o:gfxdata="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">
+                <v:shape id="Picture 1253694580" o:spid="_x0000_s1046" type="#_x0000_t75" style="position:absolute;left:55337;top:4101;width:9388;height:9632;visibility:visible;mso-wrap-style:square" o:gfxdata="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">
                   <v:imagedata r:id="rId18" o:title=""/>
                 </v:shape>
-                <v:shape id="Picture 262424483" o:spid="_x0000_s1046" type="#_x0000_t75" style="position:absolute;left:6699;top:5327;width:8763;height:8763;visibility:visible;mso-wrap-style:square" o:gfxdata="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">
+                <v:shape id="Picture 262424483" o:spid="_x0000_s1047" type="#_x0000_t75" style="position:absolute;left:6699;top:5327;width:8763;height:8763;visibility:visible;mso-wrap-style:square" o:gfxdata="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">
                   <v:imagedata r:id="rId19" o:title=""/>
                 </v:shape>
-                <v:shape id="Shape 26" o:spid="_x0000_s1047" style="position:absolute;left:190;top:17490;width:75438;height:0;visibility:visible;mso-wrap-style:square;v-text-anchor:top" coordsize="7543843,0" o:gfxdata="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" path="m7543843,l,e" filled="f" strokeweight="3pt">
+                <v:shape id="Shape 26" o:spid="_x0000_s1048" style="position:absolute;left:190;top:17490;width:75438;height:0;visibility:visible;mso-wrap-style:square;v-text-anchor:top" coordsize="7543843,0" o:gfxdata="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" path="m7543843,l,e" filled="f" strokeweight="3pt">
                   <v:stroke miterlimit="1" joinstyle="miter" endcap="round"/>
                   <v:path arrowok="t" textboxrect="0,0,7543843,0"/>
                 </v:shape>
@@ -2377,7 +2459,7 @@
           </mc:Choice>
           <mc:Fallback>
             <w:pict>
-              <v:shape w14:anchorId="5AA59D22" id="Text Box 12" o:spid="_x0000_s1048" type="#_x0000_t202" style="position:absolute;left:0;text-align:left;margin-left:-59pt;margin-top:139.35pt;width:177pt;height:31.5pt;z-index:251702272;visibility:visible;mso-wrap-style:square;mso-wrap-distance-left:9pt;mso-wrap-distance-top:0;mso-wrap-distance-right:9pt;mso-wrap-distance-bottom:0;mso-position-horizontal:absolute;mso-position-horizontal-relative:text;mso-position-vertical:absolute;mso-position-vertical-relative:text;v-text-anchor:top" o:gfxdata="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" filled="f" stroked="f" strokeweight=".5pt">
+              <v:shape w14:anchorId="5AA59D22" id="Text Box 12" o:spid="_x0000_s1049" type="#_x0000_t202" style="position:absolute;left:0;text-align:left;margin-left:-59pt;margin-top:139.35pt;width:177pt;height:31.5pt;z-index:251702272;visibility:visible;mso-wrap-style:square;mso-wrap-distance-left:9pt;mso-wrap-distance-top:0;mso-wrap-distance-right:9pt;mso-wrap-distance-bottom:0;mso-position-horizontal:absolute;mso-position-horizontal-relative:text;mso-position-vertical:absolute;mso-position-vertical-relative:text;v-text-anchor:top" o:gfxdata="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" filled="f" stroked="f" strokeweight=".5pt">
                 <v:textbox>
                   <w:txbxContent>
                     <w:p>
@@ -2528,7 +2610,7 @@
           </mc:Choice>
           <mc:Fallback>
             <w:pict>
-              <v:shape w14:anchorId="49062057" id="Text Box 10" o:spid="_x0000_s1049" type="#_x0000_t202" style="position:absolute;left:0;text-align:left;margin-left:-60.1pt;margin-top:231.05pt;width:174.75pt;height:48pt;z-index:251700224;visibility:visible;mso-wrap-style:square;mso-wrap-distance-left:9pt;mso-wrap-distance-top:0;mso-wrap-distance-right:9pt;mso-wrap-distance-bottom:0;mso-position-horizontal:absolute;mso-position-horizontal-relative:text;mso-position-vertical:absolute;mso-position-vertical-relative:text;v-text-anchor:top" o:gfxdata="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" filled="f" stroked="f" strokeweight=".5pt">
+              <v:shape w14:anchorId="49062057" id="Text Box 10" o:spid="_x0000_s1050" type="#_x0000_t202" style="position:absolute;left:0;text-align:left;margin-left:-60.1pt;margin-top:231.05pt;width:174.75pt;height:48pt;z-index:251700224;visibility:visible;mso-wrap-style:square;mso-wrap-distance-left:9pt;mso-wrap-distance-top:0;mso-wrap-distance-right:9pt;mso-wrap-distance-bottom:0;mso-position-horizontal:absolute;mso-position-horizontal-relative:text;mso-position-vertical:absolute;mso-position-vertical-relative:text;v-text-anchor:top" o:gfxdata="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" filled="f" stroked="f" strokeweight=".5pt">
                 <v:textbox>
                   <w:txbxContent>
                     <w:p>
@@ -2731,7 +2813,7 @@
           </mc:Choice>
           <mc:Fallback>
             <w:pict>
-              <v:shape w14:anchorId="3111914F" id="_x0000_s1050" type="#_x0000_t202" style="position:absolute;left:0;text-align:left;margin-left:-60.35pt;margin-top:274.65pt;width:178.35pt;height:54pt;z-index:251704320;visibility:visible;mso-wrap-style:square;mso-wrap-distance-left:9pt;mso-wrap-distance-top:3.6pt;mso-wrap-distance-right:9pt;mso-wrap-distance-bottom:3.6pt;mso-position-horizontal:absolute;mso-position-horizontal-relative:text;mso-position-vertical:absolute;mso-position-vertical-relative:text;v-text-anchor:top" o:gfxdata="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" filled="f" stroked="f">
+              <v:shape w14:anchorId="3111914F" id="_x0000_s1051" type="#_x0000_t202" style="position:absolute;left:0;text-align:left;margin-left:-60.35pt;margin-top:274.65pt;width:178.35pt;height:54pt;z-index:251704320;visibility:visible;mso-wrap-style:square;mso-wrap-distance-left:9pt;mso-wrap-distance-top:3.6pt;mso-wrap-distance-right:9pt;mso-wrap-distance-bottom:3.6pt;mso-position-horizontal:absolute;mso-position-horizontal-relative:text;mso-position-vertical:absolute;mso-position-vertical-relative:text;v-text-anchor:top" o:gfxdata="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" filled="f" stroked="f">
                 <v:textbox>
                   <w:txbxContent>
                     <w:p>
@@ -2930,7 +3012,7 @@
           </mc:Choice>
           <mc:Fallback>
             <w:pict>
-              <v:shape w14:anchorId="3FA2A0D6" id="Text Box 11" o:spid="_x0000_s1051" type="#_x0000_t202" style="position:absolute;left:0;text-align:left;margin-left:-58.35pt;margin-top:323.55pt;width:177.7pt;height:61.5pt;z-index:251701248;visibility:visible;mso-wrap-style:square;mso-wrap-distance-left:9pt;mso-wrap-distance-top:0;mso-wrap-distance-right:9pt;mso-wrap-distance-bottom:0;mso-position-horizontal:absolute;mso-position-horizontal-relative:text;mso-position-vertical:absolute;mso-position-vertical-relative:text;v-text-anchor:top" o:gfxdata="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" filled="f" stroked="f" strokeweight=".5pt">
+              <v:shape w14:anchorId="3FA2A0D6" id="Text Box 11" o:spid="_x0000_s1052" type="#_x0000_t202" style="position:absolute;left:0;text-align:left;margin-left:-58.35pt;margin-top:323.55pt;width:177.7pt;height:61.5pt;z-index:251701248;visibility:visible;mso-wrap-style:square;mso-wrap-distance-left:9pt;mso-wrap-distance-top:0;mso-wrap-distance-right:9pt;mso-wrap-distance-bottom:0;mso-position-horizontal:absolute;mso-position-horizontal-relative:text;mso-position-vertical:absolute;mso-position-vertical-relative:text;v-text-anchor:top" o:gfxdata="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" filled="f" stroked="f" strokeweight=".5pt">
                 <v:textbox>
                   <w:txbxContent>
                     <w:p>
@@ -3142,7 +3224,7 @@
           </mc:Choice>
           <mc:Fallback>
             <w:pict>
-              <v:shape w14:anchorId="0B0AA5F2" id="_x0000_s1052" type="#_x0000_t202" style="position:absolute;left:0;text-align:left;margin-left:-63.35pt;margin-top:547.65pt;width:185.9pt;height:46.5pt;z-index:251708416;visibility:visible;mso-wrap-style:square;mso-width-percent:400;mso-height-percent:0;mso-wrap-distance-left:9pt;mso-wrap-distance-top:3.6pt;mso-wrap-distance-right:9pt;mso-wrap-distance-bottom:3.6pt;mso-position-horizontal:absolute;mso-position-horizontal-relative:text;mso-position-vertical:absolute;mso-position-vertical-relative:text;mso-width-percent:400;mso-height-percent:0;mso-width-relative:margin;mso-height-relative:page;v-text-anchor:top" o:gfxdata="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" filled="f" stroked="f">
+              <v:shape w14:anchorId="0B0AA5F2" id="_x0000_s1053" type="#_x0000_t202" style="position:absolute;left:0;text-align:left;margin-left:-63.35pt;margin-top:547.65pt;width:185.9pt;height:46.5pt;z-index:251708416;visibility:visible;mso-wrap-style:square;mso-width-percent:400;mso-height-percent:0;mso-wrap-distance-left:9pt;mso-wrap-distance-top:3.6pt;mso-wrap-distance-right:9pt;mso-wrap-distance-bottom:3.6pt;mso-position-horizontal:absolute;mso-position-horizontal-relative:text;mso-position-vertical:absolute;mso-position-vertical-relative:text;mso-width-percent:400;mso-height-percent:0;mso-width-relative:margin;mso-height-relative:page;v-text-anchor:top" o:gfxdata="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" filled="f" stroked="f">
                 <v:textbox>
                   <w:txbxContent>
                     <w:p>
@@ -3331,7 +3413,7 @@
           </mc:Choice>
           <mc:Fallback>
             <w:pict>
-              <v:shape w14:anchorId="2F1D10F9" id="_x0000_s1053" type="#_x0000_t202" style="position:absolute;left:0;text-align:left;margin-left:-59.1pt;margin-top:636.25pt;width:176.25pt;height:35.25pt;z-index:251710464;visibility:visible;mso-wrap-style:square;mso-wrap-distance-left:9pt;mso-wrap-distance-top:3.6pt;mso-wrap-distance-right:9pt;mso-wrap-distance-bottom:3.6pt;mso-position-horizontal:absolute;mso-position-horizontal-relative:text;mso-position-vertical:absolute;mso-position-vertical-relative:text;v-text-anchor:top" o:gfxdata="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" filled="f" stroked="f">
+              <v:shape w14:anchorId="2F1D10F9" id="_x0000_s1054" type="#_x0000_t202" style="position:absolute;left:0;text-align:left;margin-left:-59.1pt;margin-top:636.25pt;width:176.25pt;height:35.25pt;z-index:251710464;visibility:visible;mso-wrap-style:square;mso-wrap-distance-left:9pt;mso-wrap-distance-top:3.6pt;mso-wrap-distance-right:9pt;mso-wrap-distance-bottom:3.6pt;mso-position-horizontal:absolute;mso-position-horizontal-relative:text;mso-position-vertical:absolute;mso-position-vertical-relative:text;v-text-anchor:top" o:gfxdata="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" filled="f" stroked="f">
                 <v:textbox>
                   <w:txbxContent>
                     <w:p>
@@ -3499,7 +3581,7 @@
           </mc:Choice>
           <mc:Fallback>
             <w:pict>
-              <v:shape w14:anchorId="4FCA9751" id="_x0000_s1054" type="#_x0000_t202" style="position:absolute;left:0;text-align:left;margin-left:-59.6pt;margin-top:600pt;width:177.7pt;height:35.25pt;z-index:251709440;visibility:visible;mso-wrap-style:square;mso-wrap-distance-left:9pt;mso-wrap-distance-top:3.6pt;mso-wrap-distance-right:9pt;mso-wrap-distance-bottom:3.6pt;mso-position-horizontal:absolute;mso-position-horizontal-relative:text;mso-position-vertical:absolute;mso-position-vertical-relative:text;v-text-anchor:top" o:gfxdata="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" filled="f" stroked="f">
+              <v:shape w14:anchorId="4FCA9751" id="_x0000_s1055" type="#_x0000_t202" style="position:absolute;left:0;text-align:left;margin-left:-59.6pt;margin-top:600pt;width:177.7pt;height:35.25pt;z-index:251709440;visibility:visible;mso-wrap-style:square;mso-wrap-distance-left:9pt;mso-wrap-distance-top:3.6pt;mso-wrap-distance-right:9pt;mso-wrap-distance-bottom:3.6pt;mso-position-horizontal:absolute;mso-position-horizontal-relative:text;mso-position-vertical:absolute;mso-position-vertical-relative:text;v-text-anchor:top" o:gfxdata="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" filled="f" stroked="f">
                 <v:textbox>
                   <w:txbxContent>
                     <w:p>
@@ -3715,7 +3797,7 @@
           </mc:Choice>
           <mc:Fallback>
             <w:pict>
-              <v:shape w14:anchorId="62D314F7" id="_x0000_s1055" type="#_x0000_t202" style="position:absolute;left:0;text-align:left;margin-left:-61.05pt;margin-top:489pt;width:185.9pt;height:61.5pt;z-index:251707392;visibility:visible;mso-wrap-style:square;mso-width-percent:400;mso-height-percent:0;mso-wrap-distance-left:9pt;mso-wrap-distance-top:3.6pt;mso-wrap-distance-right:9pt;mso-wrap-distance-bottom:3.6pt;mso-position-horizontal:absolute;mso-position-horizontal-relative:text;mso-position-vertical:absolute;mso-position-vertical-relative:text;mso-width-percent:400;mso-height-percent:0;mso-width-relative:margin;mso-height-relative:page;v-text-anchor:top" o:gfxdata="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" filled="f" stroked="f">
+              <v:shape w14:anchorId="62D314F7" id="_x0000_s1056" type="#_x0000_t202" style="position:absolute;left:0;text-align:left;margin-left:-61.05pt;margin-top:489pt;width:185.9pt;height:61.5pt;z-index:251707392;visibility:visible;mso-wrap-style:square;mso-width-percent:400;mso-height-percent:0;mso-wrap-distance-left:9pt;mso-wrap-distance-top:3.6pt;mso-wrap-distance-right:9pt;mso-wrap-distance-bottom:3.6pt;mso-position-horizontal:absolute;mso-position-horizontal-relative:text;mso-position-vertical:absolute;mso-position-vertical-relative:text;mso-width-percent:400;mso-height-percent:0;mso-width-relative:margin;mso-height-relative:page;v-text-anchor:top" o:gfxdata="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" filled="f" stroked="f">
                 <v:textbox>
                   <w:txbxContent>
                     <w:p>
@@ -3967,7 +4049,7 @@
           </mc:Choice>
           <mc:Fallback>
             <w:pict>
-              <v:shape w14:anchorId="3D4A672D" id="_x0000_s1056" type="#_x0000_t202" style="position:absolute;left:0;text-align:left;margin-left:-59.85pt;margin-top:430pt;width:175.5pt;height:60.75pt;z-index:251706368;visibility:visible;mso-wrap-style:square;mso-wrap-distance-left:9pt;mso-wrap-distance-top:3.6pt;mso-wrap-distance-right:9pt;mso-wrap-distance-bottom:3.6pt;mso-position-horizontal:absolute;mso-position-horizontal-relative:text;mso-position-vertical:absolute;mso-position-vertical-relative:text;v-text-anchor:top" o:gfxdata="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" filled="f" stroked="f">
+              <v:shape w14:anchorId="3D4A672D" id="_x0000_s1057" type="#_x0000_t202" style="position:absolute;left:0;text-align:left;margin-left:-59.85pt;margin-top:430pt;width:175.5pt;height:60.75pt;z-index:251706368;visibility:visible;mso-wrap-style:square;mso-wrap-distance-left:9pt;mso-wrap-distance-top:3.6pt;mso-wrap-distance-right:9pt;mso-wrap-distance-bottom:3.6pt;mso-position-horizontal:absolute;mso-position-horizontal-relative:text;mso-position-vertical:absolute;mso-position-vertical-relative:text;v-text-anchor:top" o:gfxdata="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" filled="f" stroked="f">
                 <v:textbox>
                   <w:txbxContent>
                     <w:p>
@@ -4186,7 +4268,7 @@
           </mc:Choice>
           <mc:Fallback>
             <w:pict>
-              <v:shape w14:anchorId="09B380FF" id="Text Box 13" o:spid="_x0000_s1057" type="#_x0000_t202" style="position:absolute;left:0;text-align:left;margin-left:-60.85pt;margin-top:380.25pt;width:177.6pt;height:50.25pt;z-index:251705344;visibility:visible;mso-wrap-style:square;mso-wrap-distance-left:9pt;mso-wrap-distance-top:0;mso-wrap-distance-right:9pt;mso-wrap-distance-bottom:0;mso-position-horizontal:absolute;mso-position-horizontal-relative:text;mso-position-vertical:absolute;mso-position-vertical-relative:text;v-text-anchor:top" o:gfxdata="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" filled="f" stroked="f" strokeweight=".5pt">
+              <v:shape w14:anchorId="09B380FF" id="Text Box 13" o:spid="_x0000_s1058" type="#_x0000_t202" style="position:absolute;left:0;text-align:left;margin-left:-60.85pt;margin-top:380.25pt;width:177.6pt;height:50.25pt;z-index:251705344;visibility:visible;mso-wrap-style:square;mso-wrap-distance-left:9pt;mso-wrap-distance-top:0;mso-wrap-distance-right:9pt;mso-wrap-distance-bottom:0;mso-position-horizontal:absolute;mso-position-horizontal-relative:text;mso-position-vertical:absolute;mso-position-vertical-relative:text;v-text-anchor:top" o:gfxdata="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" filled="f" stroked="f" strokeweight=".5pt">
                 <v:textbox>
                   <w:txbxContent>
                     <w:p>
@@ -4361,7 +4443,7 @@
           </mc:Choice>
           <mc:Fallback>
             <w:pict>
-              <v:shape w14:anchorId="09BFDA65" id="_x0000_s1058" type="#_x0000_t202" style="position:absolute;left:0;text-align:left;margin-left:-55.35pt;margin-top:185pt;width:169.5pt;height:52.5pt;z-index:251703296;visibility:visible;mso-wrap-style:square;mso-wrap-distance-left:9pt;mso-wrap-distance-top:0;mso-wrap-distance-right:9pt;mso-wrap-distance-bottom:0;mso-position-horizontal:absolute;mso-position-horizontal-relative:text;mso-position-vertical:absolute;mso-position-vertical-relative:text;v-text-anchor:top" o:gfxdata="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" filled="f" stroked="f" strokeweight=".5pt">
+              <v:shape w14:anchorId="09BFDA65" id="_x0000_s1059" type="#_x0000_t202" style="position:absolute;left:0;text-align:left;margin-left:-55.35pt;margin-top:185pt;width:169.5pt;height:52.5pt;z-index:251703296;visibility:visible;mso-wrap-style:square;mso-wrap-distance-left:9pt;mso-wrap-distance-top:0;mso-wrap-distance-right:9pt;mso-wrap-distance-bottom:0;mso-position-horizontal:absolute;mso-position-horizontal-relative:text;mso-position-vertical:absolute;mso-position-vertical-relative:text;v-text-anchor:top" o:gfxdata="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" filled="f" stroked="f" strokeweight=".5pt">
                 <v:textbox>
                   <w:txbxContent>
                     <w:p>
@@ -4513,7 +4595,7 @@
           </mc:Choice>
           <mc:Fallback>
             <w:pict>
-              <v:shape w14:anchorId="3000A98A" id="_x0000_s1059" type="#_x0000_t202" style="position:absolute;left:0;text-align:left;margin-left:0;margin-top:719pt;width:210.25pt;height:48.95pt;z-index:251712512;visibility:visible;mso-wrap-style:square;mso-width-percent:0;mso-height-percent:0;mso-wrap-distance-left:9pt;mso-wrap-distance-top:3.6pt;mso-wrap-distance-right:9pt;mso-wrap-distance-bottom:3.6pt;mso-position-horizontal:left;mso-position-horizontal-relative:page;mso-position-vertical:absolute;mso-position-vertical-relative:text;mso-width-percent:0;mso-height-percent:0;mso-width-relative:margin;mso-height-relative:margin;v-text-anchor:top" o:gfxdata="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" stroked="f">
+              <v:shape w14:anchorId="3000A98A" id="_x0000_s1060" type="#_x0000_t202" style="position:absolute;left:0;text-align:left;margin-left:0;margin-top:719pt;width:210.25pt;height:48.95pt;z-index:251712512;visibility:visible;mso-wrap-style:square;mso-width-percent:0;mso-height-percent:0;mso-wrap-distance-left:9pt;mso-wrap-distance-top:3.6pt;mso-wrap-distance-right:9pt;mso-wrap-distance-bottom:3.6pt;mso-position-horizontal:left;mso-position-horizontal-relative:page;mso-position-vertical:absolute;mso-position-vertical-relative:text;mso-width-percent:0;mso-height-percent:0;mso-width-relative:margin;mso-height-relative:margin;v-text-anchor:top" o:gfxdata="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" stroked="f">
                 <v:textbox>
                   <w:txbxContent>
                     <w:p>
@@ -4813,7 +4895,7 @@
           </mc:Choice>
           <mc:Fallback>
             <w:pict>
-              <v:shape w14:anchorId="6A4502F5" id="_x0000_s1060" type="#_x0000_t202" style="position:absolute;left:0;text-align:left;margin-left:127.5pt;margin-top:309.75pt;width:378.75pt;height:43.5pt;z-index:-251654144;visibility:visible;mso-wrap-style:square;mso-wrap-distance-left:9pt;mso-wrap-distance-top:3.6pt;mso-wrap-distance-right:9pt;mso-wrap-distance-bottom:3.6pt;mso-position-horizontal:absolute;mso-position-horizontal-relative:text;mso-position-vertical:absolute;mso-position-vertical-relative:text;v-text-anchor:top" o:gfxdata="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" filled="f" stroked="f">
+              <v:shape w14:anchorId="6A4502F5" id="_x0000_s1061" type="#_x0000_t202" style="position:absolute;left:0;text-align:left;margin-left:127.5pt;margin-top:309.75pt;width:378.75pt;height:43.5pt;z-index:-251654144;visibility:visible;mso-wrap-style:square;mso-wrap-distance-left:9pt;mso-wrap-distance-top:3.6pt;mso-wrap-distance-right:9pt;mso-wrap-distance-bottom:3.6pt;mso-position-horizontal:absolute;mso-position-horizontal-relative:text;mso-position-vertical:absolute;mso-position-vertical-relative:text;v-text-anchor:top" o:gfxdata="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" filled="f" stroked="f">
                 <v:textbox>
                   <w:txbxContent>
                     <w:p/>

</xml_diff>